<commit_message>
Fixed ID upload & Add Beneficiary to list & updated documentation
</commit_message>
<xml_diff>
--- a/docs/G9-IPTS_Executive_Briefing.docx
+++ b/docs/G9-IPTS_Executive_Briefing.docx
@@ -153,7 +153,7 @@
           <w:sz w:val="24"/>
           <w:szCs w:val="24"/>
         </w:rPr>
-        <w:t xml:space="preserve">Version 4.0  |  April 2026</w:t>
+        <w:t xml:space="preserve">Version 5.0  |  April 2026</w:t>
       </w:r>
     </w:p>
     <w:p>
@@ -749,7 +749,7 @@
           <w:sz w:val="22"/>
           <w:szCs w:val="22"/>
         </w:rPr>
-        <w:t xml:space="preserve">This briefing provides senior leadership with a comprehensive overview of IPTS capabilities, including the significant enhancements delivered in Version 4.0: explainable AI, dual-approval controls, real-time velocity tracking, multi-currency support, SLA monitoring, and local deployment capability.</w:t>
+        <w:t xml:space="preserve">This briefing provides senior leadership with a comprehensive overview of IPTS capabilities, including the significant enhancements delivered in Version 5.0: 17 new features spanning P2P transfers, ACH/Wire/SEPA payments, scheduled and QR code payments, multi-account management, beneficiary management, real-time ledger, virtual card generation, card controls, digital wallet provisioning, Spending 360 analytics, e-KYC verification, biometric controls, fraud alert monitoring, notification center, AI-powered support chat, and a fully redesigned 12-tab dashboard.</w:t>
       </w:r>
     </w:p>
     <w:p>
@@ -3663,7 +3663,7 @@
           <w:sz w:val="22"/>
           <w:szCs w:val="22"/>
         </w:rPr>
-        <w:t xml:space="preserve">The following screenshots demonstrate the fully operational IPTS platform v4.0, captured from the live system running locally on macOS. Each screenshot highlights a key functional area including the new SHAP explainability, four-eyes approval, FX conversion, and SLA tracking features.</w:t>
+        <w:t xml:space="preserve">The following screenshots demonstrate the fully operational IPTS platform v5.0, captured from the live system running locally on macOS. The platform now features 12 functional tabs, 5 payment channels, virtual card services, spending analytics, E-KYC verification, and real-time notifications.</w:t>
       </w:r>
     </w:p>
     <w:p>
@@ -3685,7 +3685,7 @@
           <w:sz w:val="26"/>
           <w:szCs w:val="26"/>
         </w:rPr>
-        <w:t xml:space="preserve">4.1 Dashboard — KPIs &amp; Health Monitoring</w:t>
+        <w:t xml:space="preserve">4.1 Dashboard — Multi-Account, KPIs &amp; Notifications</w:t>
       </w:r>
     </w:p>
     <w:p>
@@ -3700,7 +3700,7 @@
           <w:sz w:val="22"/>
           <w:szCs w:val="22"/>
         </w:rPr>
-        <w:t xml:space="preserve">The main dashboard provides KPI cards, settlement volume charting, AML telemetry, and a health status dot (green/yellow/red) polled every 30 seconds.</w:t>
+        <w:t xml:space="preserve">The main dashboard provides KPI cards, multi-account overview (Checking, Savings, Business), a real-time ledger panel, live FX rates ticker, settlement volume chart, AML telemetry, and a notification bell with badge count polled via SSE.</w:t>
       </w:r>
     </w:p>
     <w:p>
@@ -3713,7 +3713,7 @@
           <wp:inline distT="0" distB="0" distL="0" distR="0">
             <wp:extent cx="5524500" cy="2952750"/>
             <wp:effectExtent t="0" r="0" b="0" l="0"/>
-            <wp:docPr id="1" name="Screenshot 2026-04-09 at 11.01.04 AM" descr="Dashboard with KPIs, volume chart, and health status" title="Dashboard"/>
+            <wp:docPr id="1" name="Dashboard_MultiAccount" descr="Dashboard with multi-account cards, KPIs, and notification bell" title="Dashboard"/>
             <wp:cNvGraphicFramePr>
               <a:graphicFrameLocks xmlns:a="http://schemas.openxmlformats.org/drawingml/2006/main" noChangeAspect="1"/>
             </wp:cNvGraphicFramePr>
@@ -3763,7 +3763,7 @@
           <w:sz w:val="18"/>
           <w:szCs w:val="18"/>
         </w:rPr>
-        <w:t xml:space="preserve">Figure 7: Dashboard — KPI Cards, Settlement Volume, and Health Status</w:t>
+        <w:t xml:space="preserve">Figure 7: Dashboard — Multi-Account Cards, KPIs, and Notification Bell</w:t>
       </w:r>
     </w:p>
     <w:p>
@@ -3785,7 +3785,7 @@
           <w:sz w:val="26"/>
           <w:szCs w:val="26"/>
         </w:rPr>
-        <w:t xml:space="preserve">4.2 Payments — Multi-Currency Settlement</w:t>
+        <w:t xml:space="preserve">4.2 Dashboard — Real-Time Ledger &amp; Notifications</w:t>
       </w:r>
     </w:p>
     <w:p>
@@ -3800,7 +3800,7 @@
           <w:sz w:val="22"/>
           <w:szCs w:val="22"/>
         </w:rPr>
-        <w:t xml:space="preserve">The payment form now includes a currency selector with 13 currencies, FX preview showing the USD equivalent, and AML jurisdiction warnings for high-risk currencies. Post-settlement, SHAP feature contributions are displayed inline.</w:t>
+        <w:t xml:space="preserve">The real-time ledger shows the latest transactions with direction (debit/credit), counterparty, status, and balance. The notification center provides a dropdown panel with unread alerts for settlements, P2P transfers, card generation, and KYC verification events.</w:t>
       </w:r>
     </w:p>
     <w:p>
@@ -3813,7 +3813,7 @@
           <wp:inline distT="0" distB="0" distL="0" distR="0">
             <wp:extent cx="5524500" cy="2952750"/>
             <wp:effectExtent t="0" r="0" b="0" l="0"/>
-            <wp:docPr id="1" name="Screenshot 2026-04-09 at 11.02.13 AM" descr="Payment execution with multi-currency and SHAP" title="Payment Settlement"/>
+            <wp:docPr id="1" name="Dashboard_Ledger" descr="Real-time ledger panel" title="Ledger"/>
             <wp:cNvGraphicFramePr>
               <a:graphicFrameLocks xmlns:a="http://schemas.openxmlformats.org/drawingml/2006/main" noChangeAspect="1"/>
             </wp:cNvGraphicFramePr>
@@ -3863,7 +3863,7 @@
           <w:sz w:val="18"/>
           <w:szCs w:val="18"/>
         </w:rPr>
-        <w:t xml:space="preserve">Figure 8: Payments — Settlement with FX Preview and SHAP Contributions</w:t>
+        <w:t xml:space="preserve">Figure 8: Dashboard — Real-Time Ledger and Transaction History</w:t>
       </w:r>
     </w:p>
     <w:p>
@@ -3885,7 +3885,7 @@
           <w:sz w:val="26"/>
           <w:szCs w:val="26"/>
         </w:rPr>
-        <w:t xml:space="preserve">4.3 SHAP Feature Contributions</w:t>
+        <w:t xml:space="preserve">4.3 Payment Hub — 5 Payment Channels</w:t>
       </w:r>
     </w:p>
     <w:p>
@@ -3900,7 +3900,7 @@
           <w:sz w:val="22"/>
           <w:szCs w:val="22"/>
         </w:rPr>
-        <w:t xml:space="preserve">Every settlement returns per-transaction SHAP values showing how each of the 16 features contributed to the risk score. Positive values (red) increase risk; negative values (green) decrease risk. This provides full regulatory explainability for every AI-driven decision.</w:t>
+        <w:t xml:space="preserve">The Payments tab now features 5 sub-tabs: Settlement (multi-currency with SHAP), P2P Transfer (by username/email/phone), ACH/Wire/SEPA (external bank transfers with fee calculation), Scheduled Payments (recurring daily/weekly/bi-weekly/monthly), and QR Pay (generate/scan QR codes).</w:t>
       </w:r>
     </w:p>
     <w:p>
@@ -3911,9 +3911,9 @@
       <w:r>
         <w:drawing>
           <wp:inline distT="0" distB="0" distL="0" distR="0">
-            <wp:extent cx="5238750" cy="2857500"/>
+            <wp:extent cx="5524500" cy="2952750"/>
             <wp:effectExtent t="0" r="0" b="0" l="0"/>
-            <wp:docPr id="1" name="Screenshot 2026-04-09 at 11.01.42 AM" descr="SHAP feature values for a transaction" title="SHAP Contributions"/>
+            <wp:docPr id="1" name="Payment_Settlement" descr="Payment settlement with FX preview" title="Payment Settlement"/>
             <wp:cNvGraphicFramePr>
               <a:graphicFrameLocks xmlns:a="http://schemas.openxmlformats.org/drawingml/2006/main" noChangeAspect="1"/>
             </wp:cNvGraphicFramePr>
@@ -3936,7 +3936,7 @@
                   <pic:spPr bwMode="auto">
                     <a:xfrm>
                       <a:off x="0" y="0"/>
-                      <a:ext cx="5238750" cy="2857500"/>
+                      <a:ext cx="5524500" cy="2952750"/>
                     </a:xfrm>
                     <a:prstGeom prst="rect">
                       <a:avLst/>
@@ -3963,45 +3963,13 @@
           <w:sz w:val="18"/>
           <w:szCs w:val="18"/>
         </w:rPr>
-        <w:t xml:space="preserve">Figure 9: SHAP Feature Contributions — Per-Transaction Explainability</w:t>
+        <w:t xml:space="preserve">Figure 9: Payments — Settlement with FX Preview and SHAP Contributions</w:t>
       </w:r>
     </w:p>
     <w:p>
       <w:pPr>
         <w:spacing w:after="80"/>
       </w:pPr>
-    </w:p>
-    <w:p>
-      <w:pPr>
-        <w:pStyle w:val="Heading2"/>
-        <w:spacing w:after="160" w:before="280"/>
-      </w:pPr>
-      <w:r>
-        <w:rPr>
-          <w:rFonts w:ascii="Calibri" w:cs="Calibri" w:eastAsia="Calibri" w:hAnsi="Calibri"/>
-          <w:b/>
-          <w:bCs/>
-          <w:color w:val="1A2332"/>
-          <w:sz w:val="26"/>
-          <w:szCs w:val="26"/>
-        </w:rPr>
-        <w:t xml:space="preserve">4.4 Risk Score Breakdown</w:t>
-      </w:r>
-    </w:p>
-    <w:p>
-      <w:pPr>
-        <w:spacing w:after="120"/>
-        <w:jc w:val="both"/>
-      </w:pPr>
-      <w:r>
-        <w:rPr>
-          <w:rFonts w:ascii="Calibri" w:cs="Calibri" w:eastAsia="Calibri" w:hAnsi="Calibri"/>
-          <w:color w:val="333333"/>
-          <w:sz w:val="22"/>
-          <w:szCs w:val="22"/>
-        </w:rPr>
-        <w:t xml:space="preserve">The composite risk score is decomposed into its four components: Rules (deterministic checks), ML (5-model ensemble), NLP (watchlist screening), and Graph (PageRank centrality).</w:t>
-      </w:r>
     </w:p>
     <w:p>
       <w:pPr>
@@ -4011,9 +3979,9 @@
       <w:r>
         <w:drawing>
           <wp:inline distT="0" distB="0" distL="0" distR="0">
-            <wp:extent cx="3810000" cy="1905000"/>
+            <wp:extent cx="2667000" cy="1714500"/>
             <wp:effectExtent t="0" r="0" b="0" l="0"/>
-            <wp:docPr id="1" name="Screenshot 2026-04-09 at 11.01.48 AM" descr="Risk score component breakdown" title="Score Breakdown"/>
+            <wp:docPr id="1" name="Payment_P2P" descr="P2P transfer form" title="P2P Transfer"/>
             <wp:cNvGraphicFramePr>
               <a:graphicFrameLocks xmlns:a="http://schemas.openxmlformats.org/drawingml/2006/main" noChangeAspect="1"/>
             </wp:cNvGraphicFramePr>
@@ -4036,7 +4004,7 @@
                   <pic:spPr bwMode="auto">
                     <a:xfrm>
                       <a:off x="0" y="0"/>
-                      <a:ext cx="3810000" cy="1905000"/>
+                      <a:ext cx="2667000" cy="1714500"/>
                     </a:xfrm>
                     <a:prstGeom prst="rect">
                       <a:avLst/>
@@ -4051,69 +4019,15 @@
     </w:p>
     <w:p>
       <w:pPr>
-        <w:spacing w:after="200"/>
-        <w:jc w:val="center"/>
-      </w:pPr>
-      <w:r>
-        <w:rPr>
-          <w:rFonts w:ascii="Calibri" w:cs="Calibri" w:eastAsia="Calibri" w:hAnsi="Calibri"/>
-          <w:i/>
-          <w:iCs/>
-          <w:color w:val="777777"/>
-          <w:sz w:val="18"/>
-          <w:szCs w:val="18"/>
-        </w:rPr>
-        <w:t xml:space="preserve">Figure 10: Risk Score Breakdown — Rules, ML, NLP, Graph Components</w:t>
-      </w:r>
-    </w:p>
-    <w:p>
-      <w:r>
-        <w:br w:type="page"/>
-      </w:r>
-    </w:p>
-    <w:p>
-      <w:pPr>
-        <w:pStyle w:val="Heading2"/>
-        <w:spacing w:after="160" w:before="280"/>
-      </w:pPr>
-      <w:r>
-        <w:rPr>
-          <w:rFonts w:ascii="Calibri" w:cs="Calibri" w:eastAsia="Calibri" w:hAnsi="Calibri"/>
-          <w:b/>
-          <w:bCs/>
-          <w:color w:val="1A2332"/>
-          <w:sz w:val="26"/>
-          <w:szCs w:val="26"/>
-        </w:rPr>
-        <w:t xml:space="preserve">4.5 AI/ML — Five Model Cards</w:t>
-      </w:r>
-    </w:p>
-    <w:p>
-      <w:pPr>
-        <w:spacing w:after="120"/>
-        <w:jc w:val="both"/>
-      </w:pPr>
-      <w:r>
-        <w:rPr>
-          <w:rFonts w:ascii="Calibri" w:cs="Calibri" w:eastAsia="Calibri" w:hAnsi="Calibri"/>
-          <w:color w:val="333333"/>
-          <w:sz w:val="22"/>
-          <w:szCs w:val="22"/>
-        </w:rPr>
-        <w:t xml:space="preserve">The AI/ML tab now displays five model cards including the new Sequence Detector, each showing F1 score and accuracy. Below, the SHAP explainability chart renders a horizontal bar chart for the last transaction.</w:t>
-      </w:r>
-    </w:p>
-    <w:p>
-      <w:pPr>
         <w:spacing w:after="80" w:before="200"/>
         <w:jc w:val="center"/>
       </w:pPr>
       <w:r>
         <w:drawing>
           <wp:inline distT="0" distB="0" distL="0" distR="0">
-            <wp:extent cx="5524500" cy="3238500"/>
+            <wp:extent cx="2667000" cy="1714500"/>
             <wp:effectExtent t="0" r="0" b="0" l="0"/>
-            <wp:docPr id="1" name="Screenshot 2026-04-09 at 11.02.24 AM" descr="AI/ML tab with 5 model performance cards" title="5 Model Cards"/>
+            <wp:docPr id="1" name="Payment_ACH_Wire_SEPA" descr="External bank transfer" title="ACH/Wire/SEPA"/>
             <wp:cNvGraphicFramePr>
               <a:graphicFrameLocks xmlns:a="http://schemas.openxmlformats.org/drawingml/2006/main" noChangeAspect="1"/>
             </wp:cNvGraphicFramePr>
@@ -4136,7 +4050,7 @@
                   <pic:spPr bwMode="auto">
                     <a:xfrm>
                       <a:off x="0" y="0"/>
-                      <a:ext cx="5524500" cy="3238500"/>
+                      <a:ext cx="2667000" cy="1714500"/>
                     </a:xfrm>
                     <a:prstGeom prst="rect">
                       <a:avLst/>
@@ -4163,45 +4077,13 @@
           <w:sz w:val="18"/>
           <w:szCs w:val="18"/>
         </w:rPr>
-        <w:t xml:space="preserve">Figure 11: AI/ML — Five Model Performance Cards (Including Sequence Detector)</w:t>
+        <w:t xml:space="preserve">Figure 10: P2P Transfer (left) and ACH/Wire/SEPA External Transfer (right)</w:t>
       </w:r>
     </w:p>
     <w:p>
       <w:pPr>
         <w:spacing w:after="80"/>
       </w:pPr>
-    </w:p>
-    <w:p>
-      <w:pPr>
-        <w:pStyle w:val="Heading2"/>
-        <w:spacing w:after="160" w:before="280"/>
-      </w:pPr>
-      <w:r>
-        <w:rPr>
-          <w:rFonts w:ascii="Calibri" w:cs="Calibri" w:eastAsia="Calibri" w:hAnsi="Calibri"/>
-          <w:b/>
-          <w:bCs/>
-          <w:color w:val="1A2332"/>
-          <w:sz w:val="26"/>
-          <w:szCs w:val="26"/>
-        </w:rPr>
-        <w:t xml:space="preserve">4.6 SHAP Explainability Chart</w:t>
-      </w:r>
-    </w:p>
-    <w:p>
-      <w:pPr>
-        <w:spacing w:after="120"/>
-        <w:jc w:val="both"/>
-      </w:pPr>
-      <w:r>
-        <w:rPr>
-          <w:rFonts w:ascii="Calibri" w:cs="Calibri" w:eastAsia="Calibri" w:hAnsi="Calibri"/>
-          <w:color w:val="333333"/>
-          <w:sz w:val="22"/>
-          <w:szCs w:val="22"/>
-        </w:rPr>
-        <w:t xml:space="preserve">The SHAP chart in the AI/ML tab provides a visual breakdown of feature contributions, enabling compliance officers and data scientists to understand which features drove the risk assessment.</w:t>
-      </w:r>
     </w:p>
     <w:p>
       <w:pPr>
@@ -4211,9 +4093,9 @@
       <w:r>
         <w:drawing>
           <wp:inline distT="0" distB="0" distL="0" distR="0">
-            <wp:extent cx="5238750" cy="2857500"/>
+            <wp:extent cx="2667000" cy="1714500"/>
             <wp:effectExtent t="0" r="0" b="0" l="0"/>
-            <wp:docPr id="1" name="Screenshot 2026-04-09 at 11.02.28 AM" descr="SHAP horizontal bar chart" title="SHAP Chart"/>
+            <wp:docPr id="1" name="Payment_Scheduled" descr="Scheduled payment form" title="Scheduled Payments"/>
             <wp:cNvGraphicFramePr>
               <a:graphicFrameLocks xmlns:a="http://schemas.openxmlformats.org/drawingml/2006/main" noChangeAspect="1"/>
             </wp:cNvGraphicFramePr>
@@ -4236,7 +4118,7 @@
                   <pic:spPr bwMode="auto">
                     <a:xfrm>
                       <a:off x="0" y="0"/>
-                      <a:ext cx="5238750" cy="2857500"/>
+                      <a:ext cx="2667000" cy="1714500"/>
                     </a:xfrm>
                     <a:prstGeom prst="rect">
                       <a:avLst/>
@@ -4251,69 +4133,15 @@
     </w:p>
     <w:p>
       <w:pPr>
-        <w:spacing w:after="200"/>
-        <w:jc w:val="center"/>
-      </w:pPr>
-      <w:r>
-        <w:rPr>
-          <w:rFonts w:ascii="Calibri" w:cs="Calibri" w:eastAsia="Calibri" w:hAnsi="Calibri"/>
-          <w:i/>
-          <w:iCs/>
-          <w:color w:val="777777"/>
-          <w:sz w:val="18"/>
-          <w:szCs w:val="18"/>
-        </w:rPr>
-        <w:t xml:space="preserve">Figure 12: SHAP Explainability Chart — Feature Impact on Risk Score</w:t>
-      </w:r>
-    </w:p>
-    <w:p>
-      <w:pPr>
-        <w:spacing w:after="80"/>
-      </w:pPr>
-    </w:p>
-    <w:p>
-      <w:pPr>
-        <w:pStyle w:val="Heading2"/>
-        <w:spacing w:after="160" w:before="280"/>
-      </w:pPr>
-      <w:r>
-        <w:rPr>
-          <w:rFonts w:ascii="Calibri" w:cs="Calibri" w:eastAsia="Calibri" w:hAnsi="Calibri"/>
-          <w:b/>
-          <w:bCs/>
-          <w:color w:val="1A2332"/>
-          <w:sz w:val="26"/>
-          <w:szCs w:val="26"/>
-        </w:rPr>
-        <w:t xml:space="preserve">4.7 HITL Queue — Four-Eyes Approval</w:t>
-      </w:r>
-    </w:p>
-    <w:p>
-      <w:pPr>
-        <w:spacing w:after="120"/>
-        <w:jc w:val="both"/>
-      </w:pPr>
-      <w:r>
-        <w:rPr>
-          <w:rFonts w:ascii="Calibri" w:cs="Calibri" w:eastAsia="Calibri" w:hAnsi="Calibri"/>
-          <w:color w:val="333333"/>
-          <w:sz w:val="22"/>
-          <w:szCs w:val="22"/>
-        </w:rPr>
-        <w:t xml:space="preserve">The HITL queue now displays four-eyes approval badges (Required/1 of 2/2 of 2) for transactions &gt;= $100K. Two independent compliance officers must approve before settlement proceeds.</w:t>
-      </w:r>
-    </w:p>
-    <w:p>
-      <w:pPr>
         <w:spacing w:after="80" w:before="200"/>
         <w:jc w:val="center"/>
       </w:pPr>
       <w:r>
         <w:drawing>
           <wp:inline distT="0" distB="0" distL="0" distR="0">
-            <wp:extent cx="5524500" cy="2952750"/>
+            <wp:extent cx="2667000" cy="1714500"/>
             <wp:effectExtent t="0" r="0" b="0" l="0"/>
-            <wp:docPr id="1" name="Screenshot 2026-04-09 at 11.02.44 AM" descr="HITL queue with four-eyes badges" title="HITL Four-Eyes"/>
+            <wp:docPr id="1" name="Payment_QR_Pay" descr="QR code payment" title="QR Pay"/>
             <wp:cNvGraphicFramePr>
               <a:graphicFrameLocks xmlns:a="http://schemas.openxmlformats.org/drawingml/2006/main" noChangeAspect="1"/>
             </wp:cNvGraphicFramePr>
@@ -4336,7 +4164,7 @@
                   <pic:spPr bwMode="auto">
                     <a:xfrm>
                       <a:off x="0" y="0"/>
-                      <a:ext cx="5524500" cy="2952750"/>
+                      <a:ext cx="2667000" cy="1714500"/>
                     </a:xfrm>
                     <a:prstGeom prst="rect">
                       <a:avLst/>
@@ -4363,13 +4191,45 @@
           <w:sz w:val="18"/>
           <w:szCs w:val="18"/>
         </w:rPr>
-        <w:t xml:space="preserve">Figure 13: HITL Queue — Four-Eyes Dual Approval Badges</w:t>
-      </w:r>
-    </w:p>
-    <w:p>
-      <w:pPr>
-        <w:spacing w:after="80"/>
-      </w:pPr>
+        <w:t xml:space="preserve">Figure 11: Scheduled Payments (left) and QR Pay (right)</w:t>
+      </w:r>
+    </w:p>
+    <w:p>
+      <w:r>
+        <w:br w:type="page"/>
+      </w:r>
+    </w:p>
+    <w:p>
+      <w:pPr>
+        <w:pStyle w:val="Heading2"/>
+        <w:spacing w:after="160" w:before="280"/>
+      </w:pPr>
+      <w:r>
+        <w:rPr>
+          <w:rFonts w:ascii="Calibri" w:cs="Calibri" w:eastAsia="Calibri" w:hAnsi="Calibri"/>
+          <w:b/>
+          <w:bCs/>
+          <w:color w:val="1A2332"/>
+          <w:sz w:val="26"/>
+          <w:szCs w:val="26"/>
+        </w:rPr>
+        <w:t xml:space="preserve">4.4 Beneficiary Management</w:t>
+      </w:r>
+    </w:p>
+    <w:p>
+      <w:pPr>
+        <w:spacing w:after="120"/>
+        <w:jc w:val="both"/>
+      </w:pPr>
+      <w:r>
+        <w:rPr>
+          <w:rFonts w:ascii="Calibri" w:cs="Calibri" w:eastAsia="Calibri" w:hAnsi="Calibri"/>
+          <w:color w:val="333333"/>
+          <w:sz w:val="22"/>
+          <w:szCs w:val="22"/>
+        </w:rPr>
+        <w:t xml:space="preserve">A dedicated Beneficiaries tab enables account owners to add, edit, and manage beneficiaries with full details including account numbers, SWIFT codes, bank names, countries, currencies, and risk levels. Added beneficiaries automatically appear in the Settlement payment dropdown.</w:t>
+      </w:r>
     </w:p>
     <w:p>
       <w:pPr>
@@ -4379,9 +4239,9 @@
       <w:r>
         <w:drawing>
           <wp:inline distT="0" distB="0" distL="0" distR="0">
-            <wp:extent cx="4286250" cy="1905000"/>
+            <wp:extent cx="5524500" cy="2952750"/>
             <wp:effectExtent t="0" r="0" b="0" l="0"/>
-            <wp:docPr id="1" name="Screenshot 2026-04-09 at 12.55.04 AM" descr="Four-eyes approval enforcement dialog" title="Four-Eyes Dialog"/>
+            <wp:docPr id="1" name="Beneficiaries_Tab" descr="Beneficiary management tab" title="Beneficiaries"/>
             <wp:cNvGraphicFramePr>
               <a:graphicFrameLocks xmlns:a="http://schemas.openxmlformats.org/drawingml/2006/main" noChangeAspect="1"/>
             </wp:cNvGraphicFramePr>
@@ -4404,7 +4264,7 @@
                   <pic:spPr bwMode="auto">
                     <a:xfrm>
                       <a:off x="0" y="0"/>
-                      <a:ext cx="4286250" cy="1905000"/>
+                      <a:ext cx="5524500" cy="2952750"/>
                     </a:xfrm>
                     <a:prstGeom prst="rect">
                       <a:avLst/>
@@ -4431,7 +4291,7 @@
           <w:sz w:val="18"/>
           <w:szCs w:val="18"/>
         </w:rPr>
-        <w:t xml:space="preserve">Figure 14: Four-Eyes Enforcement — Second Approver Required</w:t>
+        <w:t xml:space="preserve">Figure 12: Beneficiary Management — Add, Edit, Delete with Risk Levels</w:t>
       </w:r>
     </w:p>
     <w:p>
@@ -4453,7 +4313,7 @@
           <w:sz w:val="26"/>
           <w:szCs w:val="26"/>
         </w:rPr>
-        <w:t xml:space="preserve">4.8 Compliance — FX Converter &amp; Sanctions</w:t>
+        <w:t xml:space="preserve">4.5 Spending 360 Analytics</w:t>
       </w:r>
     </w:p>
     <w:p>
@@ -4468,7 +4328,7 @@
           <w:sz w:val="22"/>
           <w:szCs w:val="22"/>
         </w:rPr>
-        <w:t xml:space="preserve">The Compliance tab now includes an FX Converter tool supporting 13 currencies, alongside sanctions management, SWIFT GPI tracking, and Nostro balance monitoring.</w:t>
+        <w:t xml:space="preserve">The Spending 360 dashboard provides comprehensive analytics including KPI cards (Total Sent, Total Received, Avg Risk Score, Highest Transaction, Account Balance), monthly spending trend charts, risk distribution, currency breakdown, activity by hour, and top beneficiary rankings.</w:t>
       </w:r>
     </w:p>
     <w:p>
@@ -4479,9 +4339,9 @@
       <w:r>
         <w:drawing>
           <wp:inline distT="0" distB="0" distL="0" distR="0">
-            <wp:extent cx="4286250" cy="2381250"/>
+            <wp:extent cx="5524500" cy="2952750"/>
             <wp:effectExtent t="0" r="0" b="0" l="0"/>
-            <wp:docPr id="1" name="Screenshot 2026-04-09 at 11.03.15 AM" descr="FX conversion tool" title="FX Converter"/>
+            <wp:docPr id="1" name="Spending_360_Overview" descr="Spending 360 analytics dashboard" title="Spending 360"/>
             <wp:cNvGraphicFramePr>
               <a:graphicFrameLocks xmlns:a="http://schemas.openxmlformats.org/drawingml/2006/main" noChangeAspect="1"/>
             </wp:cNvGraphicFramePr>
@@ -4504,7 +4364,7 @@
                   <pic:spPr bwMode="auto">
                     <a:xfrm>
                       <a:off x="0" y="0"/>
-                      <a:ext cx="4286250" cy="2381250"/>
+                      <a:ext cx="5524500" cy="2952750"/>
                     </a:xfrm>
                     <a:prstGeom prst="rect">
                       <a:avLst/>
@@ -4531,7 +4391,7 @@
           <w:sz w:val="18"/>
           <w:szCs w:val="18"/>
         </w:rPr>
-        <w:t xml:space="preserve">Figure 15: Compliance — FX Converter Tool (13 Currencies)</w:t>
+        <w:t xml:space="preserve">Figure 13: Spending 360 — KPI Cards and Monthly Spending Trend</w:t>
       </w:r>
     </w:p>
     <w:p>
@@ -4547,9 +4407,9 @@
       <w:r>
         <w:drawing>
           <wp:inline distT="0" distB="0" distL="0" distR="0">
-            <wp:extent cx="5238750" cy="2857500"/>
+            <wp:extent cx="5524500" cy="2952750"/>
             <wp:effectExtent t="0" r="0" b="0" l="0"/>
-            <wp:docPr id="1" name="Screenshot 2026-04-09 at 11.03.19 AM" descr="Nostro account positions" title="Nostro Balances"/>
+            <wp:docPr id="1" name="Spending_360_Charts" descr="Spending analytics charts" title="Spending Charts"/>
             <wp:cNvGraphicFramePr>
               <a:graphicFrameLocks xmlns:a="http://schemas.openxmlformats.org/drawingml/2006/main" noChangeAspect="1"/>
             </wp:cNvGraphicFramePr>
@@ -4572,7 +4432,7 @@
                   <pic:spPr bwMode="auto">
                     <a:xfrm>
                       <a:off x="0" y="0"/>
-                      <a:ext cx="5238750" cy="2857500"/>
+                      <a:ext cx="5524500" cy="2952750"/>
                     </a:xfrm>
                     <a:prstGeom prst="rect">
                       <a:avLst/>
@@ -4599,13 +4459,13 @@
           <w:sz w:val="18"/>
           <w:szCs w:val="18"/>
         </w:rPr>
-        <w:t xml:space="preserve">Figure 16: Compliance — Nostro Balances and Account Positions</w:t>
-      </w:r>
-    </w:p>
-    <w:p>
-      <w:r>
-        <w:br w:type="page"/>
-      </w:r>
+        <w:t xml:space="preserve">Figure 14: Spending 360 — Currency Breakdown and Activity Heatmap</w:t>
+      </w:r>
+    </w:p>
+    <w:p>
+      <w:pPr>
+        <w:spacing w:after="80"/>
+      </w:pPr>
     </w:p>
     <w:p>
       <w:pPr>
@@ -4621,7 +4481,7 @@
           <w:sz w:val="26"/>
           <w:szCs w:val="26"/>
         </w:rPr>
-        <w:t xml:space="preserve">4.9 Case Management — SLA Tracking</w:t>
+        <w:t xml:space="preserve">4.6 Virtual Card Services</w:t>
       </w:r>
     </w:p>
     <w:p>
@@ -4636,7 +4496,7 @@
           <w:sz w:val="22"/>
           <w:szCs w:val="22"/>
         </w:rPr>
-        <w:t xml:space="preserve">The Case Management dashboard now includes SLA countdown badges per case, color-coded by urgency. Critical cases (4h SLA) show red countdown; cases approaching breach are highlighted.</w:t>
+        <w:t xml:space="preserve">The Cards tab enables generation of Visa and Mastercard virtual cards with masked numbers, gradient styling, and spending controls. Cards can be frozen/unfrozen, provisioned to Apple Pay/Google Pay/Samsung Pay, or permanently cancelled.</w:t>
       </w:r>
     </w:p>
     <w:p>
@@ -4649,7 +4509,7 @@
           <wp:inline distT="0" distB="0" distL="0" distR="0">
             <wp:extent cx="5524500" cy="2952750"/>
             <wp:effectExtent t="0" r="0" b="0" l="0"/>
-            <wp:docPr id="1" name="Screenshot 2026-04-09 at 11.03.33 AM" descr="Case management with SLA countdown" title="Case Management SLA"/>
+            <wp:docPr id="1" name="Cards_Tab" descr="Virtual card gallery" title="Virtual Cards"/>
             <wp:cNvGraphicFramePr>
               <a:graphicFrameLocks xmlns:a="http://schemas.openxmlformats.org/drawingml/2006/main" noChangeAspect="1"/>
             </wp:cNvGraphicFramePr>
@@ -4699,13 +4559,13 @@
           <w:sz w:val="18"/>
           <w:szCs w:val="18"/>
         </w:rPr>
-        <w:t xml:space="preserve">Figure 17: Case Management — SLA Countdown Tracking</w:t>
-      </w:r>
-    </w:p>
-    <w:p>
-      <w:pPr>
-        <w:spacing w:after="80"/>
-      </w:pPr>
+        <w:t xml:space="preserve">Figure 15: Virtual Cards — Generate, Freeze, Provision to Digital Wallets</w:t>
+      </w:r>
+    </w:p>
+    <w:p>
+      <w:r>
+        <w:br w:type="page"/>
+      </w:r>
     </w:p>
     <w:p>
       <w:pPr>
@@ -4721,7 +4581,7 @@
           <w:sz w:val="26"/>
           <w:szCs w:val="26"/>
         </w:rPr>
-        <w:t xml:space="preserve">4.10 Case Detail</w:t>
+        <w:t xml:space="preserve">4.7 Security — E-KYC &amp; Fraud Monitoring</w:t>
       </w:r>
     </w:p>
     <w:p>
@@ -4736,7 +4596,7 @@
           <w:sz w:val="22"/>
           <w:szCs w:val="22"/>
         </w:rPr>
-        <w:t xml:space="preserve">Case detail modals show full case information with severity, type, associated transaction data, and action buttons for investigation, escalation, assignment, findings, and SAR filing.</w:t>
+        <w:t xml:space="preserve">The Security tab features a 3-phase E-KYC verification flow (document upload, AI processing, identity verified with confidence score), biometric control toggles (Face ID, fingerprint), and a real-time fraud alert feed with severity levels and acknowledgment controls.</w:t>
       </w:r>
     </w:p>
     <w:p>
@@ -4747,9 +4607,9 @@
       <w:r>
         <w:drawing>
           <wp:inline distT="0" distB="0" distL="0" distR="0">
-            <wp:extent cx="5238750" cy="3238500"/>
+            <wp:extent cx="5524500" cy="2952750"/>
             <wp:effectExtent t="0" r="0" b="0" l="0"/>
-            <wp:docPr id="1" name="Screenshot 2026-04-09 at 11.03.58 AM" descr="Case detail modal" title="Case Detail"/>
+            <wp:docPr id="1" name="Security_KYC" descr="E-KYC verification flow" title="E-KYC"/>
             <wp:cNvGraphicFramePr>
               <a:graphicFrameLocks xmlns:a="http://schemas.openxmlformats.org/drawingml/2006/main" noChangeAspect="1"/>
             </wp:cNvGraphicFramePr>
@@ -4772,7 +4632,7 @@
                   <pic:spPr bwMode="auto">
                     <a:xfrm>
                       <a:off x="0" y="0"/>
-                      <a:ext cx="5238750" cy="3238500"/>
+                      <a:ext cx="5524500" cy="2952750"/>
                     </a:xfrm>
                     <a:prstGeom prst="rect">
                       <a:avLst/>
@@ -4799,7 +4659,153 @@
           <w:sz w:val="18"/>
           <w:szCs w:val="18"/>
         </w:rPr>
-        <w:t xml:space="preserve">Figure 18: Case Detail — SANCTIONS Case with CRITICAL Severity</w:t>
+        <w:t xml:space="preserve">Figure 16: Security — E-KYC Verification and Biometric Controls</w:t>
+      </w:r>
+    </w:p>
+    <w:p>
+      <w:pPr>
+        <w:spacing w:after="80"/>
+      </w:pPr>
+    </w:p>
+    <w:p>
+      <w:pPr>
+        <w:pStyle w:val="Heading2"/>
+        <w:spacing w:after="160" w:before="280"/>
+      </w:pPr>
+      <w:r>
+        <w:rPr>
+          <w:rFonts w:ascii="Calibri" w:cs="Calibri" w:eastAsia="Calibri" w:hAnsi="Calibri"/>
+          <w:b/>
+          <w:bCs/>
+          <w:color w:val="1A2332"/>
+          <w:sz w:val="26"/>
+          <w:szCs w:val="26"/>
+        </w:rPr>
+        <w:t xml:space="preserve">4.8 Documents &amp; Support</w:t>
+      </w:r>
+    </w:p>
+    <w:p>
+      <w:pPr>
+        <w:spacing w:after="120"/>
+        <w:jc w:val="both"/>
+      </w:pPr>
+      <w:r>
+        <w:rPr>
+          <w:rFonts w:ascii="Calibri" w:cs="Calibri" w:eastAsia="Calibri" w:hAnsi="Calibri"/>
+          <w:color w:val="333333"/>
+          <w:sz w:val="22"/>
+          <w:szCs w:val="22"/>
+        </w:rPr>
+        <w:t xml:space="preserve">The Documents tab provides auto-generated monthly statements with download capabilities. A floating AI-powered Support Chat widget (bottom-right) responds to account, payment, security, and card queries. The Notification Center provides real-time SSE-powered alerts with mark-as-read functionality.</w:t>
+      </w:r>
+    </w:p>
+    <w:p>
+      <w:pPr>
+        <w:spacing w:after="80" w:before="200"/>
+        <w:jc w:val="center"/>
+      </w:pPr>
+      <w:r>
+        <w:drawing>
+          <wp:inline distT="0" distB="0" distL="0" distR="0">
+            <wp:extent cx="2667000" cy="1714500"/>
+            <wp:effectExtent t="0" r="0" b="0" l="0"/>
+            <wp:docPr id="1" name="Documents_Tab" descr="Document center" title="Documents"/>
+            <wp:cNvGraphicFramePr>
+              <a:graphicFrameLocks xmlns:a="http://schemas.openxmlformats.org/drawingml/2006/main" noChangeAspect="1"/>
+            </wp:cNvGraphicFramePr>
+            <a:graphic xmlns:a="http://schemas.openxmlformats.org/drawingml/2006/main">
+              <a:graphicData uri="http://schemas.openxmlformats.org/drawingml/2006/picture">
+                <pic:pic xmlns:pic="http://schemas.openxmlformats.org/drawingml/2006/picture">
+                  <pic:nvPicPr>
+                    <pic:cNvPr id="0" name="" descr=""/>
+                    <pic:cNvPicPr>
+                      <a:picLocks noChangeAspect="1" noChangeArrowheads="1"/>
+                    </pic:cNvPicPr>
+                  </pic:nvPicPr>
+                  <pic:blipFill>
+                    <a:blip r:embed="rId27" cstate="none"/>
+                    <a:srcRect/>
+                    <a:stretch>
+                      <a:fillRect/>
+                    </a:stretch>
+                  </pic:blipFill>
+                  <pic:spPr bwMode="auto">
+                    <a:xfrm>
+                      <a:off x="0" y="0"/>
+                      <a:ext cx="2667000" cy="1714500"/>
+                    </a:xfrm>
+                    <a:prstGeom prst="rect">
+                      <a:avLst/>
+                    </a:prstGeom>
+                  </pic:spPr>
+                </pic:pic>
+              </a:graphicData>
+            </a:graphic>
+          </wp:inline>
+        </w:drawing>
+      </w:r>
+    </w:p>
+    <w:p>
+      <w:pPr>
+        <w:spacing w:after="80" w:before="200"/>
+        <w:jc w:val="center"/>
+      </w:pPr>
+      <w:r>
+        <w:drawing>
+          <wp:inline distT="0" distB="0" distL="0" distR="0">
+            <wp:extent cx="2667000" cy="1714500"/>
+            <wp:effectExtent t="0" r="0" b="0" l="0"/>
+            <wp:docPr id="1" name="Support_Chat" descr="AI support chat bot" title="Support Chat"/>
+            <wp:cNvGraphicFramePr>
+              <a:graphicFrameLocks xmlns:a="http://schemas.openxmlformats.org/drawingml/2006/main" noChangeAspect="1"/>
+            </wp:cNvGraphicFramePr>
+            <a:graphic xmlns:a="http://schemas.openxmlformats.org/drawingml/2006/main">
+              <a:graphicData uri="http://schemas.openxmlformats.org/drawingml/2006/picture">
+                <pic:pic xmlns:pic="http://schemas.openxmlformats.org/drawingml/2006/picture">
+                  <pic:nvPicPr>
+                    <pic:cNvPr id="0" name="" descr=""/>
+                    <pic:cNvPicPr>
+                      <a:picLocks noChangeAspect="1" noChangeArrowheads="1"/>
+                    </pic:cNvPicPr>
+                  </pic:nvPicPr>
+                  <pic:blipFill>
+                    <a:blip r:embed="rId28" cstate="none"/>
+                    <a:srcRect/>
+                    <a:stretch>
+                      <a:fillRect/>
+                    </a:stretch>
+                  </pic:blipFill>
+                  <pic:spPr bwMode="auto">
+                    <a:xfrm>
+                      <a:off x="0" y="0"/>
+                      <a:ext cx="2667000" cy="1714500"/>
+                    </a:xfrm>
+                    <a:prstGeom prst="rect">
+                      <a:avLst/>
+                    </a:prstGeom>
+                  </pic:spPr>
+                </pic:pic>
+              </a:graphicData>
+            </a:graphic>
+          </wp:inline>
+        </w:drawing>
+      </w:r>
+    </w:p>
+    <w:p>
+      <w:pPr>
+        <w:spacing w:after="200"/>
+        <w:jc w:val="center"/>
+      </w:pPr>
+      <w:r>
+        <w:rPr>
+          <w:rFonts w:ascii="Calibri" w:cs="Calibri" w:eastAsia="Calibri" w:hAnsi="Calibri"/>
+          <w:i/>
+          <w:iCs/>
+          <w:color w:val="777777"/>
+          <w:sz w:val="18"/>
+          <w:szCs w:val="18"/>
+        </w:rPr>
+        <w:t xml:space="preserve">Figure 17: Documents Center (left) and AI Support Chat (right)</w:t>
       </w:r>
     </w:p>
     <w:p>
@@ -4836,7 +4842,7 @@
           <w:sz w:val="22"/>
           <w:szCs w:val="22"/>
         </w:rPr>
-        <w:t xml:space="preserve">IPTS v4.0 deploys a 5-model machine learning ensemble trained on 15,000 synthetic transactions using a 16-dimensional feature vector that includes 8 real-time velocity features computed by the VelocityTracker. This represents a significant upgrade from the previous 4-model, 8-feature architecture.</w:t>
+        <w:t xml:space="preserve">IPTS v5.0 deploys a 5-model machine learning ensemble trained on 15,000 synthetic transactions using a 16-dimensional feature vector that includes 8 real-time velocity features computed by the VelocityTracker. This represents a significant upgrade from the previous 4-model, 8-feature architecture.</w:t>
       </w:r>
     </w:p>
     <w:p>
@@ -5964,7 +5970,7 @@
           <w:sz w:val="22"/>
           <w:szCs w:val="22"/>
         </w:rPr>
-        <w:t xml:space="preserve">Every risk decision in IPTS v4.0 is fully explainable. The system uses SHAP (SHapley Additive exPlanations) to decompose each risk score into per-feature contributions:</w:t>
+        <w:t xml:space="preserve">Every risk decision in IPTS v5.0 is fully explainable. The system uses SHAP (SHapley Additive exPlanations) to decompose each risk score into per-feature contributions:</w:t>
       </w:r>
     </w:p>
     <w:p>
@@ -6220,7 +6226,7 @@
           <w:sz w:val="22"/>
           <w:szCs w:val="22"/>
         </w:rPr>
-        <w:t xml:space="preserve">IPTS v4.0 introduces a four-eyes dual approval mechanism that enforces segregation of duties for high-value transaction approvals, addressing a critical regulatory requirement for financial institutions.</w:t>
+        <w:t xml:space="preserve">IPTS v5.0 introduces a four-eyes dual approval mechanism that enforces segregation of duties for high-value transaction approvals, addressing a critical regulatory requirement for financial institutions.</w:t>
       </w:r>
     </w:p>
     <w:p>
@@ -12079,6 +12085,550 @@
                 <w:szCs w:val="20"/>
               </w:rPr>
               <w:t xml:space="preserve">Dual</w:t>
+            </w:r>
+          </w:p>
+        </w:tc>
+      </w:tr>
+      <w:tr>
+        <w:tc>
+          <w:tcPr>
+            <w:tcW w:type="dxa" w:w="2800"/>
+            <w:tcBorders>
+              <w:top w:val="single" w:color="CCCCCC" w:sz="1"/>
+              <w:left w:val="single" w:color="CCCCCC" w:sz="1"/>
+              <w:bottom w:val="single" w:color="CCCCCC" w:sz="1"/>
+              <w:right w:val="single" w:color="CCCCCC" w:sz="1"/>
+            </w:tcBorders>
+            <w:tcMar>
+              <w:top w:type="dxa" w:w="60"/>
+              <w:left w:type="dxa" w:w="100"/>
+              <w:bottom w:type="dxa" w:w="60"/>
+              <w:right w:type="dxa" w:w="100"/>
+            </w:tcMar>
+          </w:tcPr>
+          <w:p>
+            <w:pPr>
+              <w:jc w:val="left"/>
+            </w:pPr>
+            <w:r>
+              <w:rPr>
+                <w:rFonts w:ascii="Calibri" w:cs="Calibri" w:eastAsia="Calibri" w:hAnsi="Calibri"/>
+                <w:b/>
+                <w:bCs/>
+                <w:color w:val="333333"/>
+                <w:sz w:val="20"/>
+                <w:szCs w:val="20"/>
+              </w:rPr>
+              <w:t xml:space="preserve">Payment Channels</w:t>
+            </w:r>
+          </w:p>
+        </w:tc>
+        <w:tc>
+          <w:tcPr>
+            <w:tcW w:type="dxa" w:w="2200"/>
+            <w:tcBorders>
+              <w:top w:val="single" w:color="CCCCCC" w:sz="1"/>
+              <w:left w:val="single" w:color="CCCCCC" w:sz="1"/>
+              <w:bottom w:val="single" w:color="CCCCCC" w:sz="1"/>
+              <w:right w:val="single" w:color="CCCCCC" w:sz="1"/>
+            </w:tcBorders>
+            <w:tcMar>
+              <w:top w:type="dxa" w:w="60"/>
+              <w:left w:type="dxa" w:w="100"/>
+              <w:bottom w:type="dxa" w:w="60"/>
+              <w:right w:type="dxa" w:w="100"/>
+            </w:tcMar>
+          </w:tcPr>
+          <w:p>
+            <w:pPr>
+              <w:jc w:val="left"/>
+            </w:pPr>
+            <w:r>
+              <w:rPr>
+                <w:rFonts w:ascii="Calibri" w:cs="Calibri" w:eastAsia="Calibri" w:hAnsi="Calibri"/>
+                <w:b w:val="false"/>
+                <w:bCs w:val="false"/>
+                <w:color w:val="333333"/>
+                <w:sz w:val="20"/>
+                <w:szCs w:val="20"/>
+              </w:rPr>
+              <w:t xml:space="preserve">1 (Settlement)</w:t>
+            </w:r>
+          </w:p>
+        </w:tc>
+        <w:tc>
+          <w:tcPr>
+            <w:tcW w:type="dxa" w:w="2200"/>
+            <w:tcBorders>
+              <w:top w:val="single" w:color="CCCCCC" w:sz="1"/>
+              <w:left w:val="single" w:color="CCCCCC" w:sz="1"/>
+              <w:bottom w:val="single" w:color="CCCCCC" w:sz="1"/>
+              <w:right w:val="single" w:color="CCCCCC" w:sz="1"/>
+            </w:tcBorders>
+            <w:tcMar>
+              <w:top w:type="dxa" w:w="60"/>
+              <w:left w:type="dxa" w:w="100"/>
+              <w:bottom w:type="dxa" w:w="60"/>
+              <w:right w:type="dxa" w:w="100"/>
+            </w:tcMar>
+          </w:tcPr>
+          <w:p>
+            <w:pPr>
+              <w:jc w:val="left"/>
+            </w:pPr>
+            <w:r>
+              <w:rPr>
+                <w:rFonts w:ascii="Calibri" w:cs="Calibri" w:eastAsia="Calibri" w:hAnsi="Calibri"/>
+                <w:b/>
+                <w:bCs/>
+                <w:color w:val="10B981"/>
+                <w:sz w:val="20"/>
+                <w:szCs w:val="20"/>
+              </w:rPr>
+              <w:t xml:space="preserve">5 channels</w:t>
+            </w:r>
+          </w:p>
+        </w:tc>
+        <w:tc>
+          <w:tcPr>
+            <w:tcW w:type="dxa" w:w="2160"/>
+            <w:tcBorders>
+              <w:top w:val="single" w:color="CCCCCC" w:sz="1"/>
+              <w:left w:val="single" w:color="CCCCCC" w:sz="1"/>
+              <w:bottom w:val="single" w:color="CCCCCC" w:sz="1"/>
+              <w:right w:val="single" w:color="CCCCCC" w:sz="1"/>
+            </w:tcBorders>
+            <w:tcMar>
+              <w:top w:type="dxa" w:w="60"/>
+              <w:left w:type="dxa" w:w="100"/>
+              <w:bottom w:type="dxa" w:w="60"/>
+              <w:right w:type="dxa" w:w="100"/>
+            </w:tcMar>
+          </w:tcPr>
+          <w:p>
+            <w:pPr>
+              <w:jc w:val="left"/>
+            </w:pPr>
+            <w:r>
+              <w:rPr>
+                <w:rFonts w:ascii="Calibri" w:cs="Calibri" w:eastAsia="Calibri" w:hAnsi="Calibri"/>
+                <w:b/>
+                <w:bCs/>
+                <w:color w:val="10B981"/>
+                <w:sz w:val="20"/>
+                <w:szCs w:val="20"/>
+              </w:rPr>
+              <w:t xml:space="preserve">+400%</w:t>
+            </w:r>
+          </w:p>
+        </w:tc>
+      </w:tr>
+      <w:tr>
+        <w:tc>
+          <w:tcPr>
+            <w:tcW w:type="dxa" w:w="2800"/>
+            <w:tcBorders>
+              <w:top w:val="single" w:color="CCCCCC" w:sz="1"/>
+              <w:left w:val="single" w:color="CCCCCC" w:sz="1"/>
+              <w:bottom w:val="single" w:color="CCCCCC" w:sz="1"/>
+              <w:right w:val="single" w:color="CCCCCC" w:sz="1"/>
+            </w:tcBorders>
+            <w:shd w:fill="EDF2F7" w:val="clear"/>
+            <w:tcMar>
+              <w:top w:type="dxa" w:w="60"/>
+              <w:left w:type="dxa" w:w="100"/>
+              <w:bottom w:type="dxa" w:w="60"/>
+              <w:right w:type="dxa" w:w="100"/>
+            </w:tcMar>
+          </w:tcPr>
+          <w:p>
+            <w:pPr>
+              <w:jc w:val="left"/>
+            </w:pPr>
+            <w:r>
+              <w:rPr>
+                <w:rFonts w:ascii="Calibri" w:cs="Calibri" w:eastAsia="Calibri" w:hAnsi="Calibri"/>
+                <w:b/>
+                <w:bCs/>
+                <w:color w:val="333333"/>
+                <w:sz w:val="20"/>
+                <w:szCs w:val="20"/>
+              </w:rPr>
+              <w:t xml:space="preserve">Card Services</w:t>
+            </w:r>
+          </w:p>
+        </w:tc>
+        <w:tc>
+          <w:tcPr>
+            <w:tcW w:type="dxa" w:w="2200"/>
+            <w:tcBorders>
+              <w:top w:val="single" w:color="CCCCCC" w:sz="1"/>
+              <w:left w:val="single" w:color="CCCCCC" w:sz="1"/>
+              <w:bottom w:val="single" w:color="CCCCCC" w:sz="1"/>
+              <w:right w:val="single" w:color="CCCCCC" w:sz="1"/>
+            </w:tcBorders>
+            <w:shd w:fill="EDF2F7" w:val="clear"/>
+            <w:tcMar>
+              <w:top w:type="dxa" w:w="60"/>
+              <w:left w:type="dxa" w:w="100"/>
+              <w:bottom w:type="dxa" w:w="60"/>
+              <w:right w:type="dxa" w:w="100"/>
+            </w:tcMar>
+          </w:tcPr>
+          <w:p>
+            <w:pPr>
+              <w:jc w:val="left"/>
+            </w:pPr>
+            <w:r>
+              <w:rPr>
+                <w:rFonts w:ascii="Calibri" w:cs="Calibri" w:eastAsia="Calibri" w:hAnsi="Calibri"/>
+                <w:b w:val="false"/>
+                <w:bCs w:val="false"/>
+                <w:color w:val="333333"/>
+                <w:sz w:val="20"/>
+                <w:szCs w:val="20"/>
+              </w:rPr>
+              <w:t xml:space="preserve">None</w:t>
+            </w:r>
+          </w:p>
+        </w:tc>
+        <w:tc>
+          <w:tcPr>
+            <w:tcW w:type="dxa" w:w="2200"/>
+            <w:tcBorders>
+              <w:top w:val="single" w:color="CCCCCC" w:sz="1"/>
+              <w:left w:val="single" w:color="CCCCCC" w:sz="1"/>
+              <w:bottom w:val="single" w:color="CCCCCC" w:sz="1"/>
+              <w:right w:val="single" w:color="CCCCCC" w:sz="1"/>
+            </w:tcBorders>
+            <w:shd w:fill="EDF2F7" w:val="clear"/>
+            <w:tcMar>
+              <w:top w:type="dxa" w:w="60"/>
+              <w:left w:type="dxa" w:w="100"/>
+              <w:bottom w:type="dxa" w:w="60"/>
+              <w:right w:type="dxa" w:w="100"/>
+            </w:tcMar>
+          </w:tcPr>
+          <w:p>
+            <w:pPr>
+              <w:jc w:val="left"/>
+            </w:pPr>
+            <w:r>
+              <w:rPr>
+                <w:rFonts w:ascii="Calibri" w:cs="Calibri" w:eastAsia="Calibri" w:hAnsi="Calibri"/>
+                <w:b/>
+                <w:bCs/>
+                <w:color w:val="10B981"/>
+                <w:sz w:val="20"/>
+                <w:szCs w:val="20"/>
+              </w:rPr>
+              <w:t xml:space="preserve">Virtual cards</w:t>
+            </w:r>
+          </w:p>
+        </w:tc>
+        <w:tc>
+          <w:tcPr>
+            <w:tcW w:type="dxa" w:w="2160"/>
+            <w:tcBorders>
+              <w:top w:val="single" w:color="CCCCCC" w:sz="1"/>
+              <w:left w:val="single" w:color="CCCCCC" w:sz="1"/>
+              <w:bottom w:val="single" w:color="CCCCCC" w:sz="1"/>
+              <w:right w:val="single" w:color="CCCCCC" w:sz="1"/>
+            </w:tcBorders>
+            <w:shd w:fill="EDF2F7" w:val="clear"/>
+            <w:tcMar>
+              <w:top w:type="dxa" w:w="60"/>
+              <w:left w:type="dxa" w:w="100"/>
+              <w:bottom w:type="dxa" w:w="60"/>
+              <w:right w:type="dxa" w:w="100"/>
+            </w:tcMar>
+          </w:tcPr>
+          <w:p>
+            <w:pPr>
+              <w:jc w:val="left"/>
+            </w:pPr>
+            <w:r>
+              <w:rPr>
+                <w:rFonts w:ascii="Calibri" w:cs="Calibri" w:eastAsia="Calibri" w:hAnsi="Calibri"/>
+                <w:b/>
+                <w:bCs/>
+                <w:color w:val="10B981"/>
+                <w:sz w:val="20"/>
+                <w:szCs w:val="20"/>
+              </w:rPr>
+              <w:t xml:space="preserve">New</w:t>
+            </w:r>
+          </w:p>
+        </w:tc>
+      </w:tr>
+      <w:tr>
+        <w:tc>
+          <w:tcPr>
+            <w:tcW w:type="dxa" w:w="2800"/>
+            <w:tcBorders>
+              <w:top w:val="single" w:color="CCCCCC" w:sz="1"/>
+              <w:left w:val="single" w:color="CCCCCC" w:sz="1"/>
+              <w:bottom w:val="single" w:color="CCCCCC" w:sz="1"/>
+              <w:right w:val="single" w:color="CCCCCC" w:sz="1"/>
+            </w:tcBorders>
+            <w:tcMar>
+              <w:top w:type="dxa" w:w="60"/>
+              <w:left w:type="dxa" w:w="100"/>
+              <w:bottom w:type="dxa" w:w="60"/>
+              <w:right w:type="dxa" w:w="100"/>
+            </w:tcMar>
+          </w:tcPr>
+          <w:p>
+            <w:pPr>
+              <w:jc w:val="left"/>
+            </w:pPr>
+            <w:r>
+              <w:rPr>
+                <w:rFonts w:ascii="Calibri" w:cs="Calibri" w:eastAsia="Calibri" w:hAnsi="Calibri"/>
+                <w:b/>
+                <w:bCs/>
+                <w:color w:val="333333"/>
+                <w:sz w:val="20"/>
+                <w:szCs w:val="20"/>
+              </w:rPr>
+              <w:t xml:space="preserve">Identity (KYC)</w:t>
+            </w:r>
+          </w:p>
+        </w:tc>
+        <w:tc>
+          <w:tcPr>
+            <w:tcW w:type="dxa" w:w="2200"/>
+            <w:tcBorders>
+              <w:top w:val="single" w:color="CCCCCC" w:sz="1"/>
+              <w:left w:val="single" w:color="CCCCCC" w:sz="1"/>
+              <w:bottom w:val="single" w:color="CCCCCC" w:sz="1"/>
+              <w:right w:val="single" w:color="CCCCCC" w:sz="1"/>
+            </w:tcBorders>
+            <w:tcMar>
+              <w:top w:type="dxa" w:w="60"/>
+              <w:left w:type="dxa" w:w="100"/>
+              <w:bottom w:type="dxa" w:w="60"/>
+              <w:right w:type="dxa" w:w="100"/>
+            </w:tcMar>
+          </w:tcPr>
+          <w:p>
+            <w:pPr>
+              <w:jc w:val="left"/>
+            </w:pPr>
+            <w:r>
+              <w:rPr>
+                <w:rFonts w:ascii="Calibri" w:cs="Calibri" w:eastAsia="Calibri" w:hAnsi="Calibri"/>
+                <w:b w:val="false"/>
+                <w:bCs w:val="false"/>
+                <w:color w:val="333333"/>
+                <w:sz w:val="20"/>
+                <w:szCs w:val="20"/>
+              </w:rPr>
+              <w:t xml:space="preserve">Manual</w:t>
+            </w:r>
+          </w:p>
+        </w:tc>
+        <w:tc>
+          <w:tcPr>
+            <w:tcW w:type="dxa" w:w="2200"/>
+            <w:tcBorders>
+              <w:top w:val="single" w:color="CCCCCC" w:sz="1"/>
+              <w:left w:val="single" w:color="CCCCCC" w:sz="1"/>
+              <w:bottom w:val="single" w:color="CCCCCC" w:sz="1"/>
+              <w:right w:val="single" w:color="CCCCCC" w:sz="1"/>
+            </w:tcBorders>
+            <w:tcMar>
+              <w:top w:type="dxa" w:w="60"/>
+              <w:left w:type="dxa" w:w="100"/>
+              <w:bottom w:type="dxa" w:w="60"/>
+              <w:right w:type="dxa" w:w="100"/>
+            </w:tcMar>
+          </w:tcPr>
+          <w:p>
+            <w:pPr>
+              <w:jc w:val="left"/>
+            </w:pPr>
+            <w:r>
+              <w:rPr>
+                <w:rFonts w:ascii="Calibri" w:cs="Calibri" w:eastAsia="Calibri" w:hAnsi="Calibri"/>
+                <w:b/>
+                <w:bCs/>
+                <w:color w:val="10B981"/>
+                <w:sz w:val="20"/>
+                <w:szCs w:val="20"/>
+              </w:rPr>
+              <w:t xml:space="preserve">E-KYC automated</w:t>
+            </w:r>
+          </w:p>
+        </w:tc>
+        <w:tc>
+          <w:tcPr>
+            <w:tcW w:type="dxa" w:w="2160"/>
+            <w:tcBorders>
+              <w:top w:val="single" w:color="CCCCCC" w:sz="1"/>
+              <w:left w:val="single" w:color="CCCCCC" w:sz="1"/>
+              <w:bottom w:val="single" w:color="CCCCCC" w:sz="1"/>
+              <w:right w:val="single" w:color="CCCCCC" w:sz="1"/>
+            </w:tcBorders>
+            <w:tcMar>
+              <w:top w:type="dxa" w:w="60"/>
+              <w:left w:type="dxa" w:w="100"/>
+              <w:bottom w:type="dxa" w:w="60"/>
+              <w:right w:type="dxa" w:w="100"/>
+            </w:tcMar>
+          </w:tcPr>
+          <w:p>
+            <w:pPr>
+              <w:jc w:val="left"/>
+            </w:pPr>
+            <w:r>
+              <w:rPr>
+                <w:rFonts w:ascii="Calibri" w:cs="Calibri" w:eastAsia="Calibri" w:hAnsi="Calibri"/>
+                <w:b/>
+                <w:bCs/>
+                <w:color w:val="10B981"/>
+                <w:sz w:val="20"/>
+                <w:szCs w:val="20"/>
+              </w:rPr>
+              <w:t xml:space="preserve">New</w:t>
+            </w:r>
+          </w:p>
+        </w:tc>
+      </w:tr>
+      <w:tr>
+        <w:tc>
+          <w:tcPr>
+            <w:tcW w:type="dxa" w:w="2800"/>
+            <w:tcBorders>
+              <w:top w:val="single" w:color="CCCCCC" w:sz="1"/>
+              <w:left w:val="single" w:color="CCCCCC" w:sz="1"/>
+              <w:bottom w:val="single" w:color="CCCCCC" w:sz="1"/>
+              <w:right w:val="single" w:color="CCCCCC" w:sz="1"/>
+            </w:tcBorders>
+            <w:shd w:fill="EDF2F7" w:val="clear"/>
+            <w:tcMar>
+              <w:top w:type="dxa" w:w="60"/>
+              <w:left w:type="dxa" w:w="100"/>
+              <w:bottom w:type="dxa" w:w="60"/>
+              <w:right w:type="dxa" w:w="100"/>
+            </w:tcMar>
+          </w:tcPr>
+          <w:p>
+            <w:pPr>
+              <w:jc w:val="left"/>
+            </w:pPr>
+            <w:r>
+              <w:rPr>
+                <w:rFonts w:ascii="Calibri" w:cs="Calibri" w:eastAsia="Calibri" w:hAnsi="Calibri"/>
+                <w:b/>
+                <w:bCs/>
+                <w:color w:val="333333"/>
+                <w:sz w:val="20"/>
+                <w:szCs w:val="20"/>
+              </w:rPr>
+              <w:t xml:space="preserve">UI Tabs/Features</w:t>
+            </w:r>
+          </w:p>
+        </w:tc>
+        <w:tc>
+          <w:tcPr>
+            <w:tcW w:type="dxa" w:w="2200"/>
+            <w:tcBorders>
+              <w:top w:val="single" w:color="CCCCCC" w:sz="1"/>
+              <w:left w:val="single" w:color="CCCCCC" w:sz="1"/>
+              <w:bottom w:val="single" w:color="CCCCCC" w:sz="1"/>
+              <w:right w:val="single" w:color="CCCCCC" w:sz="1"/>
+            </w:tcBorders>
+            <w:shd w:fill="EDF2F7" w:val="clear"/>
+            <w:tcMar>
+              <w:top w:type="dxa" w:w="60"/>
+              <w:left w:type="dxa" w:w="100"/>
+              <w:bottom w:type="dxa" w:w="60"/>
+              <w:right w:type="dxa" w:w="100"/>
+            </w:tcMar>
+          </w:tcPr>
+          <w:p>
+            <w:pPr>
+              <w:jc w:val="left"/>
+            </w:pPr>
+            <w:r>
+              <w:rPr>
+                <w:rFonts w:ascii="Calibri" w:cs="Calibri" w:eastAsia="Calibri" w:hAnsi="Calibri"/>
+                <w:b w:val="false"/>
+                <w:bCs w:val="false"/>
+                <w:color w:val="333333"/>
+                <w:sz w:val="20"/>
+                <w:szCs w:val="20"/>
+              </w:rPr>
+              <w:t xml:space="preserve">7 tabs</w:t>
+            </w:r>
+          </w:p>
+        </w:tc>
+        <w:tc>
+          <w:tcPr>
+            <w:tcW w:type="dxa" w:w="2200"/>
+            <w:tcBorders>
+              <w:top w:val="single" w:color="CCCCCC" w:sz="1"/>
+              <w:left w:val="single" w:color="CCCCCC" w:sz="1"/>
+              <w:bottom w:val="single" w:color="CCCCCC" w:sz="1"/>
+              <w:right w:val="single" w:color="CCCCCC" w:sz="1"/>
+            </w:tcBorders>
+            <w:shd w:fill="EDF2F7" w:val="clear"/>
+            <w:tcMar>
+              <w:top w:type="dxa" w:w="60"/>
+              <w:left w:type="dxa" w:w="100"/>
+              <w:bottom w:type="dxa" w:w="60"/>
+              <w:right w:type="dxa" w:w="100"/>
+            </w:tcMar>
+          </w:tcPr>
+          <w:p>
+            <w:pPr>
+              <w:jc w:val="left"/>
+            </w:pPr>
+            <w:r>
+              <w:rPr>
+                <w:rFonts w:ascii="Calibri" w:cs="Calibri" w:eastAsia="Calibri" w:hAnsi="Calibri"/>
+                <w:b/>
+                <w:bCs/>
+                <w:color w:val="10B981"/>
+                <w:sz w:val="20"/>
+                <w:szCs w:val="20"/>
+              </w:rPr>
+              <w:t xml:space="preserve">12 tabs</w:t>
+            </w:r>
+          </w:p>
+        </w:tc>
+        <w:tc>
+          <w:tcPr>
+            <w:tcW w:type="dxa" w:w="2160"/>
+            <w:tcBorders>
+              <w:top w:val="single" w:color="CCCCCC" w:sz="1"/>
+              <w:left w:val="single" w:color="CCCCCC" w:sz="1"/>
+              <w:bottom w:val="single" w:color="CCCCCC" w:sz="1"/>
+              <w:right w:val="single" w:color="CCCCCC" w:sz="1"/>
+            </w:tcBorders>
+            <w:shd w:fill="EDF2F7" w:val="clear"/>
+            <w:tcMar>
+              <w:top w:type="dxa" w:w="60"/>
+              <w:left w:type="dxa" w:w="100"/>
+              <w:bottom w:type="dxa" w:w="60"/>
+              <w:right w:type="dxa" w:w="100"/>
+            </w:tcMar>
+          </w:tcPr>
+          <w:p>
+            <w:pPr>
+              <w:jc w:val="left"/>
+            </w:pPr>
+            <w:r>
+              <w:rPr>
+                <w:rFonts w:ascii="Calibri" w:cs="Calibri" w:eastAsia="Calibri" w:hAnsi="Calibri"/>
+                <w:b/>
+                <w:bCs/>
+                <w:color w:val="10B981"/>
+                <w:sz w:val="20"/>
+                <w:szCs w:val="20"/>
+              </w:rPr>
+              <w:t xml:space="preserve">+71%</w:t>
             </w:r>
           </w:p>
         </w:tc>
@@ -14562,7 +15112,7 @@
           <w:sz w:val="22"/>
           <w:szCs w:val="22"/>
         </w:rPr>
-        <w:t xml:space="preserve">IPTS v4.0 represents a transformational platform that addresses the fundamental challenges of cross-border settlement through blockchain, explainable AI, and enterprise-grade operational controls.</w:t>
+        <w:t xml:space="preserve">IPTS v5.0 represents a transformational platform that addresses the fundamental challenges of cross-border settlement through blockchain, explainable AI, enterprise-grade operational controls, and a comprehensive digital banking experience including multi-channel payments, virtual card services, spending analytics, and E-KYC verification.</w:t>
       </w:r>
     </w:p>
     <w:p>
@@ -14744,6 +15294,138 @@
           <w:szCs w:val="22"/>
         </w:rPr>
         <w:t xml:space="preserve">Health monitoring with 30-second polling provides continuous operational awareness.</w:t>
+      </w:r>
+    </w:p>
+    <w:p>
+      <w:pPr>
+        <w:spacing w:after="100"/>
+      </w:pPr>
+      <w:r>
+        <w:rPr>
+          <w:rFonts w:ascii="Calibri" w:cs="Calibri" w:eastAsia="Calibri" w:hAnsi="Calibri"/>
+          <w:sz w:val="22"/>
+          <w:szCs w:val="22"/>
+        </w:rPr>
+        <w:t xml:space="preserve">✅  </w:t>
+      </w:r>
+      <w:r>
+        <w:rPr>
+          <w:rFonts w:ascii="Calibri" w:cs="Calibri" w:eastAsia="Calibri" w:hAnsi="Calibri"/>
+          <w:color w:val="333333"/>
+          <w:sz w:val="22"/>
+          <w:szCs w:val="22"/>
+        </w:rPr>
+        <w:t xml:space="preserve">5 payment channels (Settlement, P2P, ACH/Wire/SEPA, Scheduled, QR Pay) cover all enterprise payment needs.</w:t>
+      </w:r>
+    </w:p>
+    <w:p>
+      <w:pPr>
+        <w:spacing w:after="100"/>
+      </w:pPr>
+      <w:r>
+        <w:rPr>
+          <w:rFonts w:ascii="Calibri" w:cs="Calibri" w:eastAsia="Calibri" w:hAnsi="Calibri"/>
+          <w:sz w:val="22"/>
+          <w:szCs w:val="22"/>
+        </w:rPr>
+        <w:t xml:space="preserve">✅  </w:t>
+      </w:r>
+      <w:r>
+        <w:rPr>
+          <w:rFonts w:ascii="Calibri" w:cs="Calibri" w:eastAsia="Calibri" w:hAnsi="Calibri"/>
+          <w:color w:val="333333"/>
+          <w:sz w:val="22"/>
+          <w:szCs w:val="22"/>
+        </w:rPr>
+        <w:t xml:space="preserve">Virtual card services with instant issuance, freeze/unfreeze, and spending limits enhance corporate card management.</w:t>
+      </w:r>
+    </w:p>
+    <w:p>
+      <w:pPr>
+        <w:spacing w:after="100"/>
+      </w:pPr>
+      <w:r>
+        <w:rPr>
+          <w:rFonts w:ascii="Calibri" w:cs="Calibri" w:eastAsia="Calibri" w:hAnsi="Calibri"/>
+          <w:sz w:val="22"/>
+          <w:szCs w:val="22"/>
+        </w:rPr>
+        <w:t xml:space="preserve">✅  </w:t>
+      </w:r>
+      <w:r>
+        <w:rPr>
+          <w:rFonts w:ascii="Calibri" w:cs="Calibri" w:eastAsia="Calibri" w:hAnsi="Calibri"/>
+          <w:color w:val="333333"/>
+          <w:sz w:val="22"/>
+          <w:szCs w:val="22"/>
+        </w:rPr>
+        <w:t xml:space="preserve">Spending 360 analytics with category breakdowns, trend charts, and exportable reports drive financial insights.</w:t>
+      </w:r>
+    </w:p>
+    <w:p>
+      <w:pPr>
+        <w:spacing w:after="100"/>
+      </w:pPr>
+      <w:r>
+        <w:rPr>
+          <w:rFonts w:ascii="Calibri" w:cs="Calibri" w:eastAsia="Calibri" w:hAnsi="Calibri"/>
+          <w:sz w:val="22"/>
+          <w:szCs w:val="22"/>
+        </w:rPr>
+        <w:t xml:space="preserve">✅  </w:t>
+      </w:r>
+      <w:r>
+        <w:rPr>
+          <w:rFonts w:ascii="Calibri" w:cs="Calibri" w:eastAsia="Calibri" w:hAnsi="Calibri"/>
+          <w:color w:val="333333"/>
+          <w:sz w:val="22"/>
+          <w:szCs w:val="22"/>
+        </w:rPr>
+        <w:t xml:space="preserve">E-KYC identity verification with biometric controls and fraud alert monitoring strengthen compliance posture.</w:t>
+      </w:r>
+    </w:p>
+    <w:p>
+      <w:pPr>
+        <w:spacing w:after="100"/>
+      </w:pPr>
+      <w:r>
+        <w:rPr>
+          <w:rFonts w:ascii="Calibri" w:cs="Calibri" w:eastAsia="Calibri" w:hAnsi="Calibri"/>
+          <w:sz w:val="22"/>
+          <w:szCs w:val="22"/>
+        </w:rPr>
+        <w:t xml:space="preserve">✅  </w:t>
+      </w:r>
+      <w:r>
+        <w:rPr>
+          <w:rFonts w:ascii="Calibri" w:cs="Calibri" w:eastAsia="Calibri" w:hAnsi="Calibri"/>
+          <w:color w:val="333333"/>
+          <w:sz w:val="22"/>
+          <w:szCs w:val="22"/>
+        </w:rPr>
+        <w:t xml:space="preserve">Beneficiary management with SWIFT/IBAN validation and favorite marking streamlines recurring payments.</w:t>
+      </w:r>
+    </w:p>
+    <w:p>
+      <w:pPr>
+        <w:spacing w:after="100"/>
+      </w:pPr>
+      <w:r>
+        <w:rPr>
+          <w:rFonts w:ascii="Calibri" w:cs="Calibri" w:eastAsia="Calibri" w:hAnsi="Calibri"/>
+          <w:sz w:val="22"/>
+          <w:szCs w:val="22"/>
+        </w:rPr>
+        <w:t xml:space="preserve">✅  </w:t>
+      </w:r>
+      <w:r>
+        <w:rPr>
+          <w:rFonts w:ascii="Calibri" w:cs="Calibri" w:eastAsia="Calibri" w:hAnsi="Calibri"/>
+          <w:color w:val="333333"/>
+          <w:sz w:val="22"/>
+          <w:szCs w:val="22"/>
+        </w:rPr>
+        <w:t xml:space="preserve">Real-time notification center with SSE-powered alerts and AI support chat improve user experience.</w:t>
       </w:r>
     </w:p>
     <w:p>
@@ -15060,7 +15742,7 @@
         <w:sz w:val="16"/>
         <w:szCs w:val="16"/>
       </w:rPr>
-      <w:t xml:space="preserve">  |  G9-IPTS  |  April 2026  |  Version 4.0</w:t>
+      <w:t xml:space="preserve">  |  G9-IPTS  |  April 2026  |  Version 5.0</w:t>
     </w:r>
   </w:p>
 </w:ftr>
@@ -15121,7 +15803,7 @@
         <w:sz w:val="16"/>
         <w:szCs w:val="16"/>
       </w:rPr>
-      <w:t xml:space="preserve">G9-IPTS Executive Briefing v4.0</w:t>
+      <w:t xml:space="preserve">G9-IPTS Executive Briefing v5.0</w:t>
     </w:r>
     <w:r>
       <w:rPr>

</xml_diff>